<commit_message>
Update program name placeholder
</commit_message>
<xml_diff>
--- a/FINAL_SATS_ASS.docx
+++ b/FINAL_SATS_ASS.docx
@@ -399,6 +399,20 @@
             <w:r>
               <w:rPr>
                 <w:rFonts w:ascii="Times New Roman" w:hAnsi="Times New Roman" w:cs="Times New Roman"/>
+                <w:b/>
+                <w:bCs/>
+              </w:rPr>
+              <w:t>Name:</w:t>
+            </w:r>
+            <w:r>
+              <w:rPr>
+                <w:rFonts w:ascii="Times New Roman" w:hAnsi="Times New Roman" w:cs="Times New Roman"/>
+              </w:rPr>
+              <w:t xml:space="preserve"> </w:t>
+            </w:r>
+            <w:r>
+              <w:rPr>
+                <w:rFonts w:ascii="Times New Roman" w:hAnsi="Times New Roman" w:cs="Times New Roman"/>
               </w:rPr>
               <w:t>N. Akshit Vinay</w:t>
             </w:r>
@@ -412,21 +426,37 @@
             <w:r>
               <w:rPr>
                 <w:rFonts w:ascii="Times New Roman" w:hAnsi="Times New Roman" w:cs="Times New Roman"/>
-              </w:rPr>
-              <w:t>PID: 25MSRSGIS001</w:t>
-            </w:r>
-          </w:p>
-          <w:p>
-            <w:pPr>
-              <w:rPr>
-                <w:rFonts w:ascii="Times New Roman" w:hAnsi="Times New Roman" w:cs="Times New Roman"/>
-              </w:rPr>
-            </w:pPr>
-            <w:r>
-              <w:rPr>
-                <w:rFonts w:ascii="Times New Roman" w:hAnsi="Times New Roman" w:cs="Times New Roman"/>
-              </w:rPr>
-              <w:t>Program: M.Sc. GIS &amp; Remote Sensing</w:t>
+                <w:b/>
+                <w:bCs/>
+              </w:rPr>
+              <w:t>PID:</w:t>
+            </w:r>
+            <w:r>
+              <w:rPr>
+                <w:rFonts w:ascii="Times New Roman" w:hAnsi="Times New Roman" w:cs="Times New Roman"/>
+              </w:rPr>
+              <w:t xml:space="preserve"> 25MSRSGIS001</w:t>
+            </w:r>
+          </w:p>
+          <w:p>
+            <w:pPr>
+              <w:rPr>
+                <w:rFonts w:ascii="Times New Roman" w:hAnsi="Times New Roman" w:cs="Times New Roman"/>
+              </w:rPr>
+            </w:pPr>
+            <w:r>
+              <w:rPr>
+                <w:rFonts w:ascii="Times New Roman" w:hAnsi="Times New Roman" w:cs="Times New Roman"/>
+                <w:b/>
+                <w:bCs/>
+              </w:rPr>
+              <w:t>Program:</w:t>
+            </w:r>
+            <w:r>
+              <w:rPr>
+                <w:rFonts w:ascii="Times New Roman" w:hAnsi="Times New Roman" w:cs="Times New Roman"/>
+              </w:rPr>
+              <w:t xml:space="preserve"> M.Sc. GIS &amp; Remote Sensing</w:t>
             </w:r>
           </w:p>
         </w:tc>
@@ -490,7 +520,19 @@
               <w:rPr>
                 <w:rFonts w:ascii="Times New Roman" w:hAnsi="Times New Roman" w:cs="Times New Roman"/>
               </w:rPr>
-              <w:t xml:space="preserve">             </w:t>
+              <w:t xml:space="preserve">            </w:t>
+            </w:r>
+            <w:r>
+              <w:rPr>
+                <w:rFonts w:ascii="Times New Roman" w:hAnsi="Times New Roman" w:cs="Times New Roman"/>
+              </w:rPr>
+              <w:t xml:space="preserve">          </w:t>
+            </w:r>
+            <w:r>
+              <w:rPr>
+                <w:rFonts w:ascii="Times New Roman" w:hAnsi="Times New Roman" w:cs="Times New Roman"/>
+              </w:rPr>
+              <w:t xml:space="preserve"> </w:t>
             </w:r>
             <w:r>
               <w:rPr>

</xml_diff>